<commit_message>
feat: add ledger views, portfolio insights and final metrics
</commit_message>
<xml_diff>
--- a/outputs/portfolio/消费金融经营分析AI项目_作品集.docx
+++ b/outputs/portfolio/消费金融经营分析AI项目_作品集.docx
@@ -255,12 +255,12 @@
           <w:color w:val="4B5563"/>
           <w:sz w:val="20"/>
         </w:rPr>
-        <w:t>数据底座采用 DuckDB 星型模型：客户、产品、渠道、地区、日期五个维度，申请、历史申请、分期还款、POS/信用卡账本、征信五类事实。原始表约 1,500 万行（核心三表），后续可扩展到 POS、信用卡与征信表。</w:t>
+        <w:t>数据底座采用 DuckDB 星型模型：客户、产品、渠道、地区、日期五个维度，申请、历史申请、分期还款、POS/信用卡账本、征信五类事实。原始表约 3,100 万行，覆盖 6 张业务表；bureau_balance 作为可选扩展表。</w:t>
       </w:r>
     </w:p>
     <w:tbl>
       <w:tblPr>
-        <w:tblStyle w:val="LightGrid-Accent1"/>
+        <w:tblStyle w:val="TableGrid"/>
         <w:tblW w:type="auto" w:w="0"/>
         <w:tblLook w:firstColumn="1" w:firstRow="1" w:lastColumn="0" w:lastRow="0" w:noHBand="0" w:noVBand="1" w:val="04A0"/>
       </w:tblPr>
@@ -273,6 +273,7 @@
         <w:tc>
           <w:tcPr>
             <w:tcW w:type="dxa" w:w="2592"/>
+            <w:shd w:fill="173B57"/>
           </w:tcPr>
           <w:p>
             <w:r>
@@ -289,6 +290,7 @@
         <w:tc>
           <w:tcPr>
             <w:tcW w:type="dxa" w:w="1440"/>
+            <w:shd w:fill="173B57"/>
           </w:tcPr>
           <w:p>
             <w:r>
@@ -305,6 +307,7 @@
         <w:tc>
           <w:tcPr>
             <w:tcW w:type="dxa" w:w="4896"/>
+            <w:shd w:fill="173B57"/>
           </w:tcPr>
           <w:p>
             <w:r>
@@ -482,7 +485,7 @@
                 <w:color w:val="4B5563"/>
                 <w:sz w:val="17"/>
               </w:rPr>
-              <w:t>POS / 信用卡 / 征信</w:t>
+              <w:t>POS_CASH_balance</w:t>
             </w:r>
           </w:p>
         </w:tc>
@@ -498,7 +501,7 @@
                 <w:color w:val="4B5563"/>
                 <w:sz w:val="17"/>
               </w:rPr>
-              <w:t>待接入</w:t>
+              <w:t>10,001,358</w:t>
             </w:r>
           </w:p>
         </w:tc>
@@ -514,7 +517,107 @@
                 <w:color w:val="4B5563"/>
                 <w:sz w:val="17"/>
               </w:rPr>
-              <w:t>账本与外部信用表现</w:t>
+              <w:t>POS 分期月度账本</w:t>
+            </w:r>
+          </w:p>
+        </w:tc>
+      </w:tr>
+      <w:tr>
+        <w:tc>
+          <w:tcPr>
+            <w:tcW w:type="dxa" w:w="2592"/>
+          </w:tcPr>
+          <w:p>
+            <w:r>
+              <w:rPr>
+                <w:rFonts w:ascii="Microsoft YaHei" w:hAnsi="Microsoft YaHei" w:eastAsia="Microsoft YaHei"/>
+                <w:b w:val="0"/>
+                <w:color w:val="4B5563"/>
+                <w:sz w:val="17"/>
+              </w:rPr>
+              <w:t>credit_card_balance</w:t>
+            </w:r>
+          </w:p>
+        </w:tc>
+        <w:tc>
+          <w:tcPr>
+            <w:tcW w:type="dxa" w:w="1440"/>
+          </w:tcPr>
+          <w:p>
+            <w:r>
+              <w:rPr>
+                <w:rFonts w:ascii="Microsoft YaHei" w:hAnsi="Microsoft YaHei" w:eastAsia="Microsoft YaHei"/>
+                <w:b w:val="0"/>
+                <w:color w:val="4B5563"/>
+                <w:sz w:val="17"/>
+              </w:rPr>
+              <w:t>3,840,312</w:t>
+            </w:r>
+          </w:p>
+        </w:tc>
+        <w:tc>
+          <w:tcPr>
+            <w:tcW w:type="dxa" w:w="4896"/>
+          </w:tcPr>
+          <w:p>
+            <w:r>
+              <w:rPr>
+                <w:rFonts w:ascii="Microsoft YaHei" w:hAnsi="Microsoft YaHei" w:eastAsia="Microsoft YaHei"/>
+                <w:b w:val="0"/>
+                <w:color w:val="4B5563"/>
+                <w:sz w:val="17"/>
+              </w:rPr>
+              <w:t>信用卡额度与余额账本</w:t>
+            </w:r>
+          </w:p>
+        </w:tc>
+      </w:tr>
+      <w:tr>
+        <w:tc>
+          <w:tcPr>
+            <w:tcW w:type="dxa" w:w="2592"/>
+          </w:tcPr>
+          <w:p>
+            <w:r>
+              <w:rPr>
+                <w:rFonts w:ascii="Microsoft YaHei" w:hAnsi="Microsoft YaHei" w:eastAsia="Microsoft YaHei"/>
+                <w:b w:val="0"/>
+                <w:color w:val="4B5563"/>
+                <w:sz w:val="17"/>
+              </w:rPr>
+              <w:t>bureau</w:t>
+            </w:r>
+          </w:p>
+        </w:tc>
+        <w:tc>
+          <w:tcPr>
+            <w:tcW w:type="dxa" w:w="1440"/>
+          </w:tcPr>
+          <w:p>
+            <w:r>
+              <w:rPr>
+                <w:rFonts w:ascii="Microsoft YaHei" w:hAnsi="Microsoft YaHei" w:eastAsia="Microsoft YaHei"/>
+                <w:b w:val="0"/>
+                <w:color w:val="4B5563"/>
+                <w:sz w:val="17"/>
+              </w:rPr>
+              <w:t>1,716,428</w:t>
+            </w:r>
+          </w:p>
+        </w:tc>
+        <w:tc>
+          <w:tcPr>
+            <w:tcW w:type="dxa" w:w="4896"/>
+          </w:tcPr>
+          <w:p>
+            <w:r>
+              <w:rPr>
+                <w:rFonts w:ascii="Microsoft YaHei" w:hAnsi="Microsoft YaHei" w:eastAsia="Microsoft YaHei"/>
+                <w:b w:val="0"/>
+                <w:color w:val="4B5563"/>
+                <w:sz w:val="17"/>
+              </w:rPr>
+              <w:t>外部征信与历史信用表现</w:t>
             </w:r>
           </w:p>
         </w:tc>
@@ -833,6 +936,34 @@
       </w:r>
     </w:p>
     <w:p>
+      <w:pPr>
+        <w:spacing w:after="100" w:line="324" w:lineRule="auto"/>
+      </w:pPr>
+      <w:r>
+        <w:rPr>
+          <w:rFonts w:ascii="Microsoft YaHei" w:hAnsi="Microsoft YaHei" w:eastAsia="Microsoft YaHei"/>
+          <w:b/>
+          <w:color w:val="173B57"/>
+          <w:sz w:val="20"/>
+        </w:rPr>
+        <w:t>发现六：账本结构在从分期向循环额度迁移。</w:t>
+      </w:r>
+    </w:p>
+    <w:p>
+      <w:pPr>
+        <w:spacing w:after="100" w:line="324" w:lineRule="auto"/>
+      </w:pPr>
+      <w:r>
+        <w:rPr>
+          <w:rFonts w:ascii="Microsoft YaHei" w:hAnsi="Microsoft YaHei" w:eastAsia="Microsoft YaHei"/>
+          <w:b w:val="0"/>
+          <w:color w:val="4B5563"/>
+          <w:sz w:val="20"/>
+        </w:rPr>
+        <w:t>信用卡额度使用率从 2026-06 的 41.1% 升至 2026-08 的 52.3%，但 POS 活跃合同从 18.4 万降到 9.5 万。循环额度使用上升、分期活跃下降，意味着存量客户更依赖信用卡额度；后续需要把额度使用率与 DPD30 联动监控，避免‘额度越用越满、风险越滚越大’。</w:t>
+      </w:r>
+    </w:p>
+    <w:p>
       <w:r>
         <w:br w:type="page"/>
       </w:r>
@@ -956,7 +1087,7 @@
     </w:p>
     <w:tbl>
       <w:tblPr>
-        <w:tblStyle w:val="LightGrid-Accent1"/>
+        <w:tblStyle w:val="TableGrid"/>
         <w:tblW w:type="auto" w:w="0"/>
         <w:tblLook w:firstColumn="1" w:firstRow="1" w:lastColumn="0" w:lastRow="0" w:noHBand="0" w:noVBand="1" w:val="04A0"/>
       </w:tblPr>
@@ -971,6 +1102,7 @@
         <w:tc>
           <w:tcPr>
             <w:tcW w:type="dxa" w:w="1584"/>
+            <w:shd w:fill="173B57"/>
           </w:tcPr>
           <w:p>
             <w:r>
@@ -987,6 +1119,7 @@
         <w:tc>
           <w:tcPr>
             <w:tcW w:type="dxa" w:w="2160"/>
+            <w:shd w:fill="173B57"/>
           </w:tcPr>
           <w:p>
             <w:r>
@@ -1003,6 +1136,7 @@
         <w:tc>
           <w:tcPr>
             <w:tcW w:type="dxa" w:w="2160"/>
+            <w:shd w:fill="173B57"/>
           </w:tcPr>
           <w:p>
             <w:r>
@@ -1019,6 +1153,7 @@
         <w:tc>
           <w:tcPr>
             <w:tcW w:type="dxa" w:w="2016"/>
+            <w:shd w:fill="173B57"/>
           </w:tcPr>
           <w:p>
             <w:r>
@@ -1035,6 +1170,7 @@
         <w:tc>
           <w:tcPr>
             <w:tcW w:type="dxa" w:w="1440"/>
+            <w:shd w:fill="173B57"/>
           </w:tcPr>
           <w:p>
             <w:r>
@@ -1297,7 +1433,7 @@
           <w:color w:val="4B5563"/>
           <w:sz w:val="19"/>
         </w:rPr>
-        <w:t>Excel 工作簿：8 张表、原生图表、指标口径页，可直接用于经营例会。</w:t>
+        <w:t>Excel 工作簿：9 张表、原生图表、指标口径页，可直接用于经营例会。</w:t>
       </w:r>
     </w:p>
     <w:p>
@@ -1467,7 +1603,7 @@
     </w:p>
     <w:tbl>
       <w:tblPr>
-        <w:tblStyle w:val="LightGrid-Accent1"/>
+        <w:tblStyle w:val="TableGrid"/>
         <w:tblW w:type="auto" w:w="0"/>
         <w:tblLook w:firstColumn="1" w:firstRow="1" w:lastColumn="0" w:lastRow="0" w:noHBand="0" w:noVBand="1" w:val="04A0"/>
       </w:tblPr>
@@ -1480,6 +1616,7 @@
         <w:tc>
           <w:tcPr>
             <w:tcW w:type="dxa" w:w="2448"/>
+            <w:shd w:fill="173B57"/>
           </w:tcPr>
           <w:p>
             <w:r>
@@ -1496,6 +1633,7 @@
         <w:tc>
           <w:tcPr>
             <w:tcW w:type="dxa" w:w="2880"/>
+            <w:shd w:fill="173B57"/>
           </w:tcPr>
           <w:p>
             <w:r>
@@ -1512,6 +1650,7 @@
         <w:tc>
           <w:tcPr>
             <w:tcW w:type="dxa" w:w="4320"/>
+            <w:shd w:fill="173B57"/>
           </w:tcPr>
           <w:p>
             <w:r>

</xml_diff>

<commit_message>
feat: finalize full Home Credit data coverage
</commit_message>
<xml_diff>
--- a/outputs/portfolio/消费金融经营分析AI项目_作品集.docx
+++ b/outputs/portfolio/消费金融经营分析AI项目_作品集.docx
@@ -255,7 +255,7 @@
           <w:color w:val="4B5563"/>
           <w:sz w:val="20"/>
         </w:rPr>
-        <w:t>数据底座采用 DuckDB 星型模型：客户、产品、渠道、地区、日期五个维度，申请、历史申请、分期还款、POS/信用卡账本、征信五类事实。原始表约 3,100 万行，覆盖 6 张业务表；bureau_balance 作为可选扩展表。</w:t>
+        <w:t>数据底座采用 DuckDB 星型模型：客户、产品、渠道、地区、日期五个维度，申请、历史申请、分期还款、POS/信用卡账本、征信五类事实。原始表约 5,800 万行，覆盖 7 张业务表。</w:t>
       </w:r>
     </w:p>
     <w:tbl>
@@ -618,6 +618,56 @@
                 <w:sz w:val="17"/>
               </w:rPr>
               <w:t>外部征信与历史信用表现</w:t>
+            </w:r>
+          </w:p>
+        </w:tc>
+      </w:tr>
+      <w:tr>
+        <w:tc>
+          <w:tcPr>
+            <w:tcW w:type="dxa" w:w="2592"/>
+          </w:tcPr>
+          <w:p>
+            <w:r>
+              <w:rPr>
+                <w:rFonts w:ascii="Microsoft YaHei" w:hAnsi="Microsoft YaHei" w:eastAsia="Microsoft YaHei"/>
+                <w:b w:val="0"/>
+                <w:color w:val="4B5563"/>
+                <w:sz w:val="17"/>
+              </w:rPr>
+              <w:t>bureau_balance</w:t>
+            </w:r>
+          </w:p>
+        </w:tc>
+        <w:tc>
+          <w:tcPr>
+            <w:tcW w:type="dxa" w:w="1440"/>
+          </w:tcPr>
+          <w:p>
+            <w:r>
+              <w:rPr>
+                <w:rFonts w:ascii="Microsoft YaHei" w:hAnsi="Microsoft YaHei" w:eastAsia="Microsoft YaHei"/>
+                <w:b w:val="0"/>
+                <w:color w:val="4B5563"/>
+                <w:sz w:val="17"/>
+              </w:rPr>
+              <w:t>27,299,925</w:t>
+            </w:r>
+          </w:p>
+        </w:tc>
+        <w:tc>
+          <w:tcPr>
+            <w:tcW w:type="dxa" w:w="4896"/>
+          </w:tcPr>
+          <w:p>
+            <w:r>
+              <w:rPr>
+                <w:rFonts w:ascii="Microsoft YaHei" w:hAnsi="Microsoft YaHei" w:eastAsia="Microsoft YaHei"/>
+                <w:b w:val="0"/>
+                <w:color w:val="4B5563"/>
+                <w:sz w:val="17"/>
+              </w:rPr>
+              <w:t>征信月度状态账本</w:t>
             </w:r>
           </w:p>
         </w:tc>

</xml_diff>